<commit_message>
Adapta el modelo relacional: precio unico, sin atributos derivables ni logica fiel
- creacion_tablas.sql: PRODUCTOS con precio unico; quita es_cliente_fiel,
  subtotal/profit de detalle_ventas, precio_total/costo_total/estado_entrega de
  ventas, total de compras y subtotal de detalle_compras (y sus CHECKs)
- generar_datos.py + poblado_datos.sql: regenerados al nuevo esquema
- queries 2.1/2.2, validar_datos.sql, create_index_23.sql y docx 2.3:
  montos calculados al vuelo (cantidad*precio_unidad, etc.)
- mapreduce_spark.ipynb: reconstruye montos desde el detalle (join/calculo)
- mongodb_documental.ipynb: 100 combos y reordenado (generacion en 4.2.1,
  insercion en 4.2.2)
- der.drawio, INFORME.md, INFORME_CONDENSADO.md y CLAUDE.md actualizados

Co-Authored-By: Claude Opus 4.8 (1M context) <noreply@anthropic.com>
</commit_message>
<xml_diff>
--- a/Ejercicio_2.3_Analisis_Performance.docx
+++ b/Ejercicio_2.3_Analisis_Performance.docx
@@ -56,9 +56,9 @@
         <w:br/>
         <w:t xml:space="preserve">           SUM(dv.cantidad) AS unidades_vendidas,</w:t>
         <w:br/>
-        <w:t xml:space="preserve">           SUM(dv.subtotal) AS ingresos,</w:t>
+        <w:t xml:space="preserve">           SUM(dv.cantidad * dv.precio_unidad) AS ingresos,</w:t>
         <w:br/>
-        <w:t xml:space="preserve">           SUM(dv.profit)   AS profit_total</w:t>
+        <w:t xml:space="preserve">           SUM(dv.cantidad * (dv.precio_unidad - dv.costo_unidad)) AS profit_total</w:t>
         <w:br/>
         <w:t xml:space="preserve">    FROM DETALLE_VENTAS dv</w:t>
         <w:br/>
@@ -529,7 +529,7 @@
         <w:pStyle w:val="ListBullet"/>
       </w:pPr>
       <w:r>
-        <w:t>El Sort por (categoria_id, profit_total DESC) ordena por profit_total, que es un valor CALCULADO (SUM(dv.profit) del GROUP BY). No existe como columna en ninguna tabla base, por lo que ningún índice puede entregarlo pre-ordenado.</w:t>
+        <w:t>El Sort por (categoria_id, profit_total DESC) ordena por profit_total, que es un valor CALCULADO (SUM(dv.cantidad*(dv.precio_unidad-dv.costo_unidad)) del GROUP BY). No existe como columna en ninguna tabla base, por lo que ningún índice puede entregarlo pre-ordenado.</w:t>
       </w:r>
     </w:p>
     <w:p>
@@ -566,7 +566,7 @@
         </w:rPr>
         <w:t>CREATE INDEX idx_detalle_ventas_producto</w:t>
         <w:br/>
-        <w:t>ON detalle_ventas (product_id) INCLUDE (cantidad, subtotal, profit);</w:t>
+        <w:t>ON detalle_ventas (product_id) INCLUDE (cantidad, precio_unidad, costo_unidad);</w:t>
       </w:r>
     </w:p>
     <w:p>
@@ -587,7 +587,7 @@
         <w:pStyle w:val="ListBullet"/>
       </w:pPr>
       <w:r>
-        <w:t>Habilita un Index Only Scan: la cláusula INCLUDE (cantidad, subtotal, profit) agrega al índice las tres columnas que la consulta agrega (los SUM). Así PostgreSQL resuelve la lectura completamente desde el índice, sin acceder al heap (la tabla), lo que reduce las páginas leídas (visible en EXPLAIN (ANALYZE, BUFFERS)).</w:t>
+        <w:t>Habilita un Index Only Scan: la cláusula INCLUDE (cantidad, precio_unidad, costo_unidad) agrega al índice las columnas base que la consulta necesita para calcular los SUM (cantidad, precio_unidad, costo_unidad). Así PostgreSQL resuelve la lectura completamente desde el índice, sin acceder al heap (la tabla), lo que reduce las páginas leídas (visible en EXPLAIN (ANALYZE, BUFFERS)).</w:t>
       </w:r>
     </w:p>
     <w:p>

</xml_diff>